<commit_message>
Add bracketed literature citations
</commit_message>
<xml_diff>
--- a/developer/fall-26/thesis/Tursyn_CSCI693_Literature_Review_Introduction_AI_Free_Sample_Format.docx
+++ b/developer/fall-26/thesis/Tursyn_CSCI693_Literature_Review_Introduction_AI_Free_Sample_Format.docx
@@ -275,7 +275,7 @@
                 <w:sz w:val="20"/>
                 <w:szCs w:val="20"/>
               </w:rPr>
-              <w:t>Vaswani et al.; Devlin et al.; Sze et al.</w:t>
+              <w:t>Vaswani et al. [1]; Devlin et al.; Sze et al. [2]</w:t>
             </w:r>
           </w:p>
         </w:tc>
@@ -361,7 +361,7 @@
                 <w:sz w:val="20"/>
                 <w:szCs w:val="20"/>
               </w:rPr>
-              <w:t>FlashAttention 1-3; Native Sparse Attention; LLM in a Flash</w:t>
+              <w:t>FlashAttention 1-3 [5]; Native Sparse Attention [8]; LLM in a Flash [7]</w:t>
             </w:r>
           </w:p>
         </w:tc>
@@ -447,7 +447,7 @@
                 <w:sz w:val="20"/>
                 <w:szCs w:val="20"/>
               </w:rPr>
-              <w:t>CUDAAdvisor; Wu et al.; Benazir and Lin; Apple MLX research</w:t>
+              <w:t>CUDAAdvisor [3]; Wu et al.; Benazir and Lin [8]; Apple MLX research</w:t>
             </w:r>
           </w:p>
         </w:tc>
@@ -533,7 +533,7 @@
                 <w:sz w:val="20"/>
                 <w:szCs w:val="20"/>
               </w:rPr>
-              <w:t>PagedAttention; MLPerf Inference; Schryen</w:t>
+              <w:t>PagedAttention [6]; MLPerf Inference; Schryen [7]</w:t>
             </w:r>
           </w:p>
         </w:tc>
@@ -610,7 +610,7 @@
           <w:sz w:val="24"/>
           <w:szCs w:val="24"/>
         </w:rPr>
-        <w:t>Vaswani et al. define the parallel attention computation that later systems research optimizes, while Devlin et al. show how the Transformer became a reusable workload through BERT. Sze et al. provide the systems bridge by explaining that energy and latency depend strongly on data reuse and memory access. Together, these studies establish why operation count alone cannot predict inference performance. They also motivate separate treatment of prefill, which processes many prompt tokens in parallel, and decode, which repeatedly reads weights and the growing key value cache.</w:t>
+        <w:t>Vaswani et al. [1] define the parallel attention computation that later systems research optimizes, while Devlin et al. show how the Transformer became a reusable workload through BERT. Sze et al. [2] provide the systems bridge by explaining that energy and latency depend strongly on data reuse and memory access. Together, these studies establish why operation count alone cannot predict inference performance. They also motivate separate treatment of prefill, which processes many prompt tokens in parallel, and decode, which repeatedly reads weights and the growing key value cache.</w:t>
       </w:r>
     </w:p>
     <w:p>
@@ -637,7 +637,7 @@
           <w:sz w:val="24"/>
           <w:szCs w:val="24"/>
         </w:rPr>
-        <w:t>FlashAttention preserves exact dense attention but tiles and fuses operations to reduce transfers between high bandwidth memory and on chip storage. FlashAttention 2 improves work partitioning, and FlashAttention 3 exploits Hopper specific asynchrony and lower precision execution. The sequence shows that the underlying principle is portable, while later implementations become increasingly architecture dependent. Native Sparse Attention addresses the same long context pressure by reducing token interactions, whereas LLM in a Flash changes parameter residency between storage and memory. These studies belong together because each reduces unnecessary computation or movement, although at a different level of the memory hierarchy.</w:t>
+        <w:t>FlashAttention [5] preserves exact dense attention but tiles and fuses operations to reduce transfers between high bandwidth memory and on chip storage. FlashAttention 2 [5] improves work partitioning, and FlashAttention 3 [5] exploits Hopper specific asynchrony and lower precision execution. The sequence shows that the underlying principle is portable, while later implementations become increasingly architecture dependent. Native Sparse Attention [8] addresses the same long context pressure by reducing token interactions, whereas LLM in a Flash [7] changes parameter residency between storage and memory. These studies belong together because each reduces unnecessary computation or movement, although at a different level of the memory hierarchy.</w:t>
       </w:r>
     </w:p>
     <w:p>
@@ -664,7 +664,7 @@
           <w:sz w:val="24"/>
           <w:szCs w:val="24"/>
         </w:rPr>
-        <w:t>CUDAAdvisor and the GPU optimization survey by Mittal and Vaishay emphasize profiler evidence such as memory reuse, divergence, utilization, and kernel time. Benazir and Lin extend the discussion to Apple Silicon and show that unified memory and quantization behavior must be interpreted at system level. Apple MLX research further distinguishes compute constrained prompt processing from bandwidth constrained generation, but it is platform evidence rather than independent peer reviewed validation. PagedAttention complements kernel work by improving key value cache allocation and sharing, while Wu et al. show that operator support and hardware fragmentation affect edge deployment. A faster attention kernel may therefore produce a smaller application gain when cache management, batching, or unsupported operators dominate.</w:t>
+        <w:t>CUDAAdvisor [3] and the GPU optimization survey by Mittal and Vaishay [4] emphasize profiler evidence such as memory reuse, divergence, utilization, and kernel time. Benazir and Lin [8] extend the discussion to Apple Silicon and show that unified memory and quantization behavior must be interpreted at system level. Apple MLX research further distinguishes compute constrained prompt processing from bandwidth constrained generation, but it is platform evidence rather than independent peer reviewed validation. PagedAttention [6] complements kernel work by improving key value cache allocation and sharing, while Wu et al. show that operator support and hardware fragmentation affect edge deployment. A faster attention kernel may therefore produce a smaller application gain when cache management, batching, or unsupported operators dominate.</w:t>
       </w:r>
     </w:p>
     <w:p>
@@ -691,7 +691,7 @@
           <w:sz w:val="24"/>
           <w:szCs w:val="24"/>
         </w:rPr>
-        <w:t>MLPerf Inference demonstrates the need for fixed scenarios, quality constraints, declared software versions, and repeatable run rules. Schryen's analysis of parallel speedup explains why serial work and overhead limit acceleration. These studies support a within platform comparison: each optimized CUDA or Metal path should be measured against a native baseline under the same model, precision, batch size, and sequence length. Absolute cross platform numbers can still be reported, but they should not be interpreted as the effect of the API alone.</w:t>
+        <w:t>MLPerf Inference demonstrates the need for fixed scenarios, quality constraints, declared software versions, and repeatable run rules. Schryen's [7] analysis of parallel speedup explains why serial work and overhead limit acceleration. These studies support a within platform comparison: each optimized CUDA or Metal path should be measured against a native baseline under the same model, precision, batch size, and sequence length. Absolute cross platform numbers can still be reported, but they should not be interpreted as the effect of the API alone.</w:t>
       </w:r>
     </w:p>
     <w:p>
@@ -780,7 +780,7 @@
           <w:szCs w:val="32"/>
           <w:b/>
         </w:rPr>
-        <w:t>Selected references</w:t>
+        <w:t>References</w:t>
       </w:r>
     </w:p>
     <w:p>
@@ -796,7 +796,7 @@
           <w:sz w:val="24"/>
           <w:szCs w:val="24"/>
         </w:rPr>
-        <w:t>Vaswani et al. (2017), Attention Is All You Need, NeurIPS.</w:t>
+        <w:t>[1] Vaswani et al. (2017), Attention Is All You Need, NeurIPS.</w:t>
       </w:r>
     </w:p>
     <w:p>
@@ -812,7 +812,7 @@
           <w:sz w:val="24"/>
           <w:szCs w:val="24"/>
         </w:rPr>
-        <w:t>Sze et al. (2017), Efficient Processing of Deep Neural Networks, Proceedings of the IEEE.</w:t>
+        <w:t>[2] Sze et al. (2017), Efficient Processing of Deep Neural Networks, Proceedings of the IEEE.</w:t>
       </w:r>
     </w:p>
     <w:p>
@@ -828,7 +828,7 @@
           <w:sz w:val="24"/>
           <w:szCs w:val="24"/>
         </w:rPr>
-        <w:t>Shen et al. (2018), CUDAAdvisor, CGO.</w:t>
+        <w:t>[3] Shen et al. (2018), CUDAAdvisor, CGO.</w:t>
       </w:r>
     </w:p>
     <w:p>
@@ -844,7 +844,7 @@
           <w:sz w:val="24"/>
           <w:szCs w:val="24"/>
         </w:rPr>
-        <w:t>Mittal and Vaishay (2019), Survey of Techniques for Optimizing Deep Learning on GPUs, Journal of Systems Architecture.</w:t>
+        <w:t>[4] Mittal and Vaishay (2019), Survey of Techniques for Optimizing Deep Learning on GPUs, Journal of Systems Architecture.</w:t>
       </w:r>
     </w:p>
     <w:p>
@@ -860,7 +860,7 @@
           <w:sz w:val="24"/>
           <w:szCs w:val="24"/>
         </w:rPr>
-        <w:t>Dao et al. (2022), FlashAttention, NeurIPS; Dao (2024), FlashAttention 2, ICLR; Shah et al. (2024), FlashAttention 3, NeurIPS.</w:t>
+        <w:t>[5] Dao et al. (2022), FlashAttention, NeurIPS; Dao (2024), FlashAttention 2, ICLR; Shah et al. (2024), FlashAttention 3, NeurIPS.</w:t>
       </w:r>
     </w:p>
     <w:p>
@@ -876,7 +876,7 @@
           <w:sz w:val="24"/>
           <w:szCs w:val="24"/>
         </w:rPr>
-        <w:t>Kwon et al. (2023), Efficient Memory Management for LLM Serving with PagedAttention, SOSP.</w:t>
+        <w:t>[6] Kwon et al. (2023), Efficient Memory Management for LLM Serving with PagedAttention, SOSP.</w:t>
       </w:r>
     </w:p>
     <w:p>
@@ -892,7 +892,7 @@
           <w:sz w:val="24"/>
           <w:szCs w:val="24"/>
         </w:rPr>
-        <w:t>Alizadeh et al. (2024), LLM in a Flash, ACL; Schryen (2024), Speedup and Efficiency of Computational Parallelization, JPDC.</w:t>
+        <w:t>[7] Alizadeh et al. (2024), LLM in a Flash, ACL; Schryen (2024), Speedup and Efficiency of Computational Parallelization, JPDC.</w:t>
       </w:r>
     </w:p>
     <w:p>
@@ -908,7 +908,7 @@
           <w:sz w:val="24"/>
           <w:szCs w:val="24"/>
         </w:rPr>
-        <w:t>Yuan et al. (2025), Native Sparse Attention, ACL; Benazir and Lin (2025), LLM Inference on Apple Silicon, ACM PACM MACS.</w:t>
+        <w:t>[8] Yuan et al. (2025), Native Sparse Attention, ACL; Benazir and Lin (2025), LLM Inference on Apple Silicon, ACM PACM MACS.</w:t>
       </w:r>
     </w:p>
     <w:sectPr>

</xml_diff>